<commit_message>
fix(texte): keine Gedankenstriche mehr auf der Website
Gedankenstriche (—, –) als Satzzeichen in allen sichtbaren Website-Texten
durch Punkt, Komma, Doppelpunkt oder Klammern ersetzt: messages de/en,
Ratgeber, Beispiel-Arztbrief (Downloads neu erzeugt), Mails, Partner-
Formular, finditoo-Landingpage.

Seitentitel einheitlich „Thema | custix“ (wie Impressum, AGB, Ratgeber).

Bewusst unverändert: AGB (Vertragstext, Änderung nur nach § 11), die
Adresse „Barichgasse 40–42“, die Trennlinie vor dem deutschen Rechtstext
auf den englischen Rechtsseiten, Code-Kommentare.

Co-Authored-By: Claude Opus 5.5 <noreply@anthropic.com>
</commit_message>
<xml_diff>
--- a/public/ratgeber/beispiel-arztbrief-platzhalter.docx
+++ b/public/ratgeber/beispiel-arztbrief-platzhalter.docx
@@ -13,7 +13,7 @@
           <w:color w:val="94A3B8"/>
           <w:sz w:val="16"/>
         </w:rPr>
-        <w:t>Beispieldaten: Alle Personen, Einrichtungen, Daten und Befunde sind erfunden. Kein Behandlungsstandard, kein medizinischer Rat. Vorlage von custix.ai – frei verwendbar.</w:t>
+        <w:t>Beispieldaten: Alle Personen, Einrichtungen, Daten und Befunde sind erfunden. Kein Behandlungsstandard, kein medizinischer Rat. Vorlage von custix.ai, frei verwendbar.</w:t>
       </w:r>
     </w:p>
     <w:p>
@@ -195,7 +195,7 @@
           <w:b/>
           <w:i w:val="0"/>
         </w:rPr>
-        <w:t xml:space="preserve"> – stationärer Aufenthalt </w:t>
+        <w:t xml:space="preserve">, stationärer Aufenthalt </w:t>
       </w:r>
       <w:r>
         <w:rPr>

</xml_diff>